<commit_message>
last fix before move to production
</commit_message>
<xml_diff>
--- a/docs/システム仕様書.docx
+++ b/docs/システム仕様書.docx
@@ -126,12 +126,39 @@
         <w:rPr>
           <w:rFonts w:hint="eastAsia"/>
         </w:rPr>
-        <w:t>、管理者、上位管理者</w:t>
-      </w:r>
-    </w:p>
-    <w:p>
-      <w:pPr>
-        <w:ind w:firstLineChars="100" w:firstLine="210"/>
+        <w:t>、</w:t>
+      </w:r>
+      <w:r>
+        <w:rPr>
+          <w:rFonts w:hint="eastAsia"/>
+        </w:rPr>
+        <w:t>デモ</w:t>
+      </w:r>
+      <w:r>
+        <w:rPr>
+          <w:rFonts w:hint="eastAsia"/>
+        </w:rPr>
+        <w:t>管理者、</w:t>
+      </w:r>
+      <w:r>
+        <w:rPr>
+          <w:rFonts w:hint="eastAsia"/>
+        </w:rPr>
+        <w:t>通常</w:t>
+      </w:r>
+      <w:r>
+        <w:rPr>
+          <w:rFonts w:hint="eastAsia"/>
+        </w:rPr>
+        <w:t>管理者</w:t>
+      </w:r>
+    </w:p>
+    <w:p>
+      <w:pPr>
+        <w:ind w:firstLineChars="100" w:firstLine="210"/>
+        <w:rPr>
+          <w:rFonts w:hint="eastAsia"/>
+        </w:rPr>
       </w:pPr>
       <w:r>
         <w:rPr>
@@ -147,6 +174,12 @@
         <w:t>Github</w:t>
       </w:r>
       <w:proofErr w:type="spellEnd"/>
+      <w:r>
+        <w:rPr>
+          <w:rFonts w:hint="eastAsia"/>
+        </w:rPr>
+        <w:t>/Bootstrap</w:t>
+      </w:r>
     </w:p>
     <w:p>
       <w:pPr>
@@ -173,7 +206,31 @@
         <w:rPr>
           <w:rFonts w:hint="eastAsia"/>
         </w:rPr>
-        <w:t xml:space="preserve">　▪権限レベル：一般ユーザー/管理者/上位管理者</w:t>
+        <w:t xml:space="preserve">　▪権限レベル：一般ユーザー/</w:t>
+      </w:r>
+      <w:r>
+        <w:rPr>
+          <w:rFonts w:hint="eastAsia"/>
+        </w:rPr>
+        <w:t>demo</w:t>
+      </w:r>
+      <w:r>
+        <w:rPr>
+          <w:rFonts w:hint="eastAsia"/>
+        </w:rPr>
+        <w:t>管理者/</w:t>
+      </w:r>
+      <w:r>
+        <w:rPr>
+          <w:rFonts w:hint="eastAsia"/>
+        </w:rPr>
+        <w:t>admin</w:t>
+      </w:r>
+      <w:r>
+        <w:rPr>
+          <w:rFonts w:hint="eastAsia"/>
+        </w:rPr>
+        <w:t>管理者</w:t>
       </w:r>
     </w:p>
     <w:p/>
@@ -226,18 +283,18 @@
         <w:rPr>
           <w:rFonts w:hint="eastAsia"/>
         </w:rPr>
-        <w:t>▪決済方法選択　※疑似と明記</w:t>
-      </w:r>
-    </w:p>
-    <w:p>
-      <w:pPr>
-        <w:ind w:firstLineChars="100" w:firstLine="210"/>
-      </w:pPr>
-      <w:r>
-        <w:rPr>
-          <w:rFonts w:hint="eastAsia"/>
-        </w:rPr>
-        <w:t>▪決済確認　※疑似と明記</w:t>
+        <w:t>▪決済方法選択　※疑似</w:t>
+      </w:r>
+    </w:p>
+    <w:p>
+      <w:pPr>
+        <w:ind w:firstLineChars="100" w:firstLine="210"/>
+      </w:pPr>
+      <w:r>
+        <w:rPr>
+          <w:rFonts w:hint="eastAsia"/>
+        </w:rPr>
+        <w:t>▪決済確認　※疑似</w:t>
       </w:r>
     </w:p>
     <w:p>
@@ -281,7 +338,13 @@
         <w:rPr>
           <w:rFonts w:hint="eastAsia"/>
         </w:rPr>
-        <w:t xml:space="preserve">　　　・商品登録</w:t>
+        <w:t xml:space="preserve">　　　・商品</w:t>
+      </w:r>
+      <w:r>
+        <w:rPr>
+          <w:rFonts w:hint="eastAsia"/>
+        </w:rPr>
+        <w:t>一覧</w:t>
       </w:r>
     </w:p>
     <w:p>
@@ -410,6 +473,22 @@
       </w:r>
       <w:proofErr w:type="spellStart"/>
       <w:r>
+        <w:t>payment_method</w:t>
+      </w:r>
+      <w:proofErr w:type="spellEnd"/>
+    </w:p>
+    <w:p>
+      <w:pPr>
+        <w:ind w:firstLineChars="100" w:firstLine="210"/>
+      </w:pPr>
+      <w:r>
+        <w:rPr>
+          <w:rFonts w:hint="eastAsia"/>
+        </w:rPr>
+        <w:t>▪</w:t>
+      </w:r>
+      <w:proofErr w:type="spellStart"/>
+      <w:r>
         <w:t>purchase_datetime</w:t>
       </w:r>
       <w:proofErr w:type="spellEnd"/>
@@ -418,33 +497,74 @@
       <w:pPr>
         <w:ind w:firstLineChars="100" w:firstLine="210"/>
       </w:pPr>
+    </w:p>
+    <w:p>
+      <w:r>
+        <w:rPr>
+          <w:rFonts w:hint="eastAsia"/>
+        </w:rPr>
+        <w:t>⑵．</w:t>
+      </w:r>
+      <w:proofErr w:type="spellStart"/>
+      <w:r>
+        <w:t>order</w:t>
+      </w:r>
+      <w:r>
+        <w:rPr>
+          <w:rFonts w:hint="eastAsia"/>
+        </w:rPr>
+        <w:t>_details</w:t>
+      </w:r>
+      <w:proofErr w:type="spellEnd"/>
+      <w:r>
+        <w:t>テーブル</w:t>
+      </w:r>
+    </w:p>
+    <w:p>
+      <w:pPr>
+        <w:ind w:firstLineChars="100" w:firstLine="210"/>
+      </w:pPr>
       <w:r>
         <w:rPr>
           <w:rFonts w:hint="eastAsia"/>
         </w:rPr>
         <w:t>▪</w:t>
       </w:r>
+      <w:r>
+        <w:t>id</w:t>
+      </w:r>
+    </w:p>
+    <w:p>
+      <w:pPr>
+        <w:ind w:firstLineChars="100" w:firstLine="210"/>
+      </w:pPr>
+      <w:r>
+        <w:rPr>
+          <w:rFonts w:hint="eastAsia"/>
+        </w:rPr>
+        <w:t>▪</w:t>
+      </w:r>
       <w:proofErr w:type="spellStart"/>
       <w:r>
-        <w:t>payment_method</w:t>
+        <w:t>ordered_id</w:t>
       </w:r>
       <w:proofErr w:type="spellEnd"/>
     </w:p>
     <w:p>
-      <w:r>
-        <w:rPr>
-          <w:rFonts w:hint="eastAsia"/>
-        </w:rPr>
-        <w:t>⑵．</w:t>
+      <w:pPr>
+        <w:ind w:firstLineChars="100" w:firstLine="210"/>
+      </w:pPr>
+      <w:r>
+        <w:rPr>
+          <w:rFonts w:hint="eastAsia"/>
+        </w:rPr>
+        <w:t>▪</w:t>
       </w:r>
       <w:proofErr w:type="spellStart"/>
       <w:r>
-        <w:t>ordered_items</w:t>
+        <w:t>item_id</w:t>
       </w:r>
       <w:proofErr w:type="spellEnd"/>
-      <w:r>
-        <w:t>テーブル</w:t>
-      </w:r>
     </w:p>
     <w:p>
       <w:pPr>
@@ -457,6 +577,95 @@
         <w:t>▪</w:t>
       </w:r>
       <w:r>
+        <w:t>name</w:t>
+      </w:r>
+    </w:p>
+    <w:p>
+      <w:pPr>
+        <w:ind w:firstLineChars="100" w:firstLine="210"/>
+      </w:pPr>
+      <w:r>
+        <w:rPr>
+          <w:rFonts w:hint="eastAsia"/>
+        </w:rPr>
+        <w:t>▪</w:t>
+      </w:r>
+      <w:r>
+        <w:t>price</w:t>
+      </w:r>
+    </w:p>
+    <w:p>
+      <w:pPr>
+        <w:ind w:firstLineChars="100" w:firstLine="210"/>
+      </w:pPr>
+      <w:r>
+        <w:rPr>
+          <w:rFonts w:hint="eastAsia"/>
+        </w:rPr>
+        <w:t>▪</w:t>
+      </w:r>
+      <w:r>
+        <w:t>quantity</w:t>
+      </w:r>
+    </w:p>
+    <w:p>
+      <w:pPr>
+        <w:ind w:firstLineChars="100" w:firstLine="210"/>
+      </w:pPr>
+      <w:r>
+        <w:rPr>
+          <w:rFonts w:hint="eastAsia"/>
+        </w:rPr>
+        <w:t>▪</w:t>
+      </w:r>
+      <w:r>
+        <w:t>subtotal</w:t>
+      </w:r>
+    </w:p>
+    <w:p>
+      <w:pPr>
+        <w:ind w:firstLineChars="100" w:firstLine="210"/>
+        <w:rPr>
+          <w:rFonts w:hint="eastAsia"/>
+        </w:rPr>
+      </w:pPr>
+      <w:r>
+        <w:rPr>
+          <w:rFonts w:hint="eastAsia"/>
+        </w:rPr>
+        <w:t>▪</w:t>
+      </w:r>
+      <w:proofErr w:type="spellStart"/>
+      <w:r>
+        <w:rPr>
+          <w:rFonts w:hint="eastAsia"/>
+        </w:rPr>
+        <w:t>created_at</w:t>
+      </w:r>
+      <w:proofErr w:type="spellEnd"/>
+    </w:p>
+    <w:p>
+      <w:r>
+        <w:rPr>
+          <w:rFonts w:hint="eastAsia"/>
+        </w:rPr>
+        <w:t>⑶．</w:t>
+      </w:r>
+      <w:r>
+        <w:t>itemsテーブル</w:t>
+      </w:r>
+    </w:p>
+    <w:p>
+      <w:pPr>
+        <w:ind w:firstLineChars="100" w:firstLine="210"/>
+      </w:pPr>
+      <w:r>
+        <w:rPr>
+          <w:rFonts w:hint="eastAsia"/>
+        </w:rPr>
+        <w:t>▪</w:t>
+      </w:r>
+      <w:r>
         <w:t>id</w:t>
       </w:r>
     </w:p>
@@ -470,15 +679,83 @@
         </w:rPr>
         <w:t>▪</w:t>
       </w:r>
+      <w:r>
+        <w:t>name</w:t>
+      </w:r>
+    </w:p>
+    <w:p>
+      <w:pPr>
+        <w:ind w:firstLineChars="100" w:firstLine="210"/>
+      </w:pPr>
+      <w:r>
+        <w:rPr>
+          <w:rFonts w:hint="eastAsia"/>
+        </w:rPr>
+        <w:t>▪</w:t>
+      </w:r>
+      <w:r>
+        <w:rPr>
+          <w:rFonts w:hint="eastAsia"/>
+        </w:rPr>
+        <w:t>category</w:t>
+      </w:r>
+    </w:p>
+    <w:p>
+      <w:pPr>
+        <w:ind w:firstLineChars="100" w:firstLine="210"/>
+        <w:rPr>
+          <w:rFonts w:hint="eastAsia"/>
+        </w:rPr>
+      </w:pPr>
+      <w:r>
+        <w:rPr>
+          <w:rFonts w:hint="eastAsia"/>
+        </w:rPr>
+        <w:t>▪price</w:t>
+      </w:r>
+    </w:p>
+    <w:p>
+      <w:pPr>
+        <w:ind w:firstLineChars="100" w:firstLine="210"/>
+        <w:rPr>
+          <w:rFonts w:hint="eastAsia"/>
+        </w:rPr>
+      </w:pPr>
+      <w:r>
+        <w:rPr>
+          <w:rFonts w:hint="eastAsia"/>
+        </w:rPr>
+        <w:t>▪</w:t>
+      </w:r>
+      <w:r>
+        <w:rPr>
+          <w:rFonts w:hint="eastAsia"/>
+        </w:rPr>
+        <w:t>description</w:t>
+      </w:r>
+    </w:p>
+    <w:p>
+      <w:pPr>
+        <w:ind w:firstLineChars="100" w:firstLine="210"/>
+      </w:pPr>
+      <w:r>
+        <w:rPr>
+          <w:rFonts w:hint="eastAsia"/>
+        </w:rPr>
+        <w:t>▪</w:t>
+      </w:r>
       <w:proofErr w:type="spellStart"/>
       <w:r>
-        <w:t>ordered_id</w:t>
+        <w:t>created_at</w:t>
       </w:r>
       <w:proofErr w:type="spellEnd"/>
     </w:p>
     <w:p>
       <w:pPr>
         <w:ind w:firstLineChars="100" w:firstLine="210"/>
+        <w:rPr>
+          <w:rFonts w:hint="eastAsia"/>
+        </w:rPr>
       </w:pPr>
       <w:r>
         <w:rPr>
@@ -488,11 +765,25 @@
       </w:r>
       <w:proofErr w:type="spellStart"/>
       <w:r>
-        <w:t>item_id</w:t>
+        <w:rPr>
+          <w:rFonts w:hint="eastAsia"/>
+        </w:rPr>
+        <w:t>updated_at</w:t>
       </w:r>
       <w:proofErr w:type="spellEnd"/>
     </w:p>
     <w:p>
+      <w:r>
+        <w:rPr>
+          <w:rFonts w:hint="eastAsia"/>
+        </w:rPr>
+        <w:t>⑷．</w:t>
+      </w:r>
+      <w:r>
+        <w:t>adminsテーブル</w:t>
+      </w:r>
+    </w:p>
+    <w:p>
       <w:pPr>
         <w:ind w:firstLineChars="100" w:firstLine="210"/>
       </w:pPr>
@@ -503,7 +794,7 @@
         <w:t>▪</w:t>
       </w:r>
       <w:r>
-        <w:t>name</w:t>
+        <w:t>id</w:t>
       </w:r>
     </w:p>
     <w:p>
@@ -517,12 +808,29 @@
         <w:t>▪</w:t>
       </w:r>
       <w:r>
-        <w:t>price</w:t>
-      </w:r>
-    </w:p>
-    <w:p>
-      <w:pPr>
-        <w:ind w:firstLineChars="100" w:firstLine="210"/>
+        <w:t>username</w:t>
+      </w:r>
+    </w:p>
+    <w:p>
+      <w:pPr>
+        <w:ind w:firstLineChars="100" w:firstLine="210"/>
+        <w:rPr>
+          <w:rFonts w:hint="eastAsia"/>
+        </w:rPr>
+      </w:pPr>
+      <w:r>
+        <w:rPr>
+          <w:rFonts w:hint="eastAsia"/>
+        </w:rPr>
+        <w:t>▪role</w:t>
+      </w:r>
+    </w:p>
+    <w:p>
+      <w:pPr>
+        <w:ind w:firstLineChars="100" w:firstLine="210"/>
+        <w:rPr>
+          <w:rFonts w:hint="eastAsia"/>
+        </w:rPr>
       </w:pPr>
       <w:r>
         <w:rPr>
@@ -530,9 +838,14 @@
         </w:rPr>
         <w:t>▪</w:t>
       </w:r>
-      <w:r>
-        <w:t>quantity</w:t>
-      </w:r>
+      <w:proofErr w:type="spellStart"/>
+      <w:r>
+        <w:rPr>
+          <w:rFonts w:hint="eastAsia"/>
+        </w:rPr>
+        <w:t>created_at</w:t>
+      </w:r>
+      <w:proofErr w:type="spellEnd"/>
     </w:p>
     <w:p>
       <w:pPr>
@@ -544,24 +857,21 @@
         </w:rPr>
         <w:t>▪</w:t>
       </w:r>
-      <w:r>
-        <w:t>subtotal</w:t>
-      </w:r>
-    </w:p>
-    <w:p>
-      <w:r>
-        <w:rPr>
-          <w:rFonts w:hint="eastAsia"/>
-        </w:rPr>
-        <w:t>⑶．</w:t>
-      </w:r>
-      <w:r>
-        <w:t>itemsテーブル</w:t>
-      </w:r>
-    </w:p>
-    <w:p>
-      <w:pPr>
-        <w:ind w:firstLineChars="100" w:firstLine="210"/>
+      <w:proofErr w:type="spellStart"/>
+      <w:r>
+        <w:rPr>
+          <w:rFonts w:hint="eastAsia"/>
+        </w:rPr>
+        <w:t>updated_at</w:t>
+      </w:r>
+      <w:proofErr w:type="spellEnd"/>
+    </w:p>
+    <w:p>
+      <w:pPr>
+        <w:ind w:firstLineChars="100" w:firstLine="210"/>
+        <w:rPr>
+          <w:rFonts w:hint="eastAsia"/>
+        </w:rPr>
       </w:pPr>
       <w:r>
         <w:rPr>
@@ -569,150 +879,12 @@
         </w:rPr>
         <w:t>▪</w:t>
       </w:r>
-      <w:r>
-        <w:t>id</w:t>
-      </w:r>
-    </w:p>
-    <w:p>
-      <w:pPr>
-        <w:ind w:firstLineChars="100" w:firstLine="210"/>
-      </w:pPr>
-      <w:r>
-        <w:rPr>
-          <w:rFonts w:hint="eastAsia"/>
-        </w:rPr>
-        <w:t>▪</w:t>
-      </w:r>
-      <w:r>
-        <w:t>name</w:t>
-      </w:r>
-    </w:p>
-    <w:p>
-      <w:pPr>
-        <w:ind w:firstLineChars="100" w:firstLine="210"/>
-      </w:pPr>
-      <w:r>
-        <w:rPr>
-          <w:rFonts w:hint="eastAsia"/>
-        </w:rPr>
-        <w:t>▪</w:t>
-      </w:r>
-      <w:r>
-        <w:t>about</w:t>
-      </w:r>
-    </w:p>
-    <w:p>
-      <w:pPr>
-        <w:ind w:firstLineChars="100" w:firstLine="210"/>
-      </w:pPr>
-      <w:r>
-        <w:rPr>
-          <w:rFonts w:hint="eastAsia"/>
-        </w:rPr>
-        <w:t>▪</w:t>
-      </w:r>
-      <w:r>
-        <w:t>price</w:t>
-      </w:r>
-    </w:p>
-    <w:p>
-      <w:pPr>
-        <w:ind w:firstLineChars="100" w:firstLine="210"/>
-      </w:pPr>
-      <w:r>
-        <w:rPr>
-          <w:rFonts w:hint="eastAsia"/>
-        </w:rPr>
-        <w:t>▪</w:t>
-      </w:r>
       <w:proofErr w:type="spellStart"/>
       <w:r>
-        <w:t>created_at</w:t>
-      </w:r>
-      <w:proofErr w:type="spellEnd"/>
-    </w:p>
-    <w:p>
-      <w:pPr>
-        <w:ind w:firstLineChars="100" w:firstLine="210"/>
-      </w:pPr>
-      <w:r>
-        <w:rPr>
-          <w:rFonts w:hint="eastAsia"/>
-        </w:rPr>
-        <w:t>▪</w:t>
-      </w:r>
-      <w:r>
-        <w:t>status</w:t>
-      </w:r>
-    </w:p>
-    <w:p>
-      <w:r>
-        <w:rPr>
-          <w:rFonts w:hint="eastAsia"/>
-        </w:rPr>
-        <w:t>⑷．</w:t>
-      </w:r>
-      <w:r>
-        <w:t>adminsテーブル</w:t>
-      </w:r>
-    </w:p>
-    <w:p>
-      <w:pPr>
-        <w:ind w:firstLineChars="100" w:firstLine="210"/>
-      </w:pPr>
-      <w:r>
-        <w:rPr>
-          <w:rFonts w:hint="eastAsia"/>
-        </w:rPr>
-        <w:t>▪</w:t>
-      </w:r>
-      <w:r>
-        <w:t>id</w:t>
-      </w:r>
-    </w:p>
-    <w:p>
-      <w:pPr>
-        <w:ind w:firstLineChars="100" w:firstLine="210"/>
-      </w:pPr>
-      <w:r>
-        <w:rPr>
-          <w:rFonts w:hint="eastAsia"/>
-        </w:rPr>
-        <w:t>▪</w:t>
-      </w:r>
-      <w:r>
-        <w:t>username</w:t>
-      </w:r>
-    </w:p>
-    <w:p>
-      <w:pPr>
-        <w:ind w:firstLineChars="100" w:firstLine="210"/>
-      </w:pPr>
-      <w:r>
-        <w:rPr>
-          <w:rFonts w:hint="eastAsia"/>
-        </w:rPr>
-        <w:t>▪</w:t>
-      </w:r>
-      <w:proofErr w:type="spellStart"/>
-      <w:r>
+        <w:rPr>
+          <w:rFonts w:hint="eastAsia"/>
+        </w:rPr>
         <w:t>password_hash</w:t>
-      </w:r>
-      <w:proofErr w:type="spellEnd"/>
-    </w:p>
-    <w:p>
-      <w:pPr>
-        <w:ind w:firstLineChars="100" w:firstLine="210"/>
-      </w:pPr>
-      <w:r>
-        <w:rPr>
-          <w:rFonts w:hint="eastAsia"/>
-        </w:rPr>
-        <w:t>▪</w:t>
-      </w:r>
-      <w:proofErr w:type="spellStart"/>
-      <w:r>
-        <w:t>created_at</w:t>
       </w:r>
       <w:proofErr w:type="spellEnd"/>
     </w:p>
@@ -818,46 +990,24 @@
         <w:rPr>
           <w:rFonts w:hint="eastAsia"/>
         </w:rPr>
-        <w:t>▪</w:t>
-      </w:r>
-      <w:r>
-        <w:t>管理者ログインボタン　ログインすると商品登録・商品情報編集・商品削除・商品情報インポート・エクスポート・購入履歴検索・購入履歴一覧が可能</w:t>
-      </w:r>
-    </w:p>
-    <w:p>
-      <w:r>
-        <w:t> </w:t>
-      </w:r>
-    </w:p>
-    <w:p>
-      <w:r>
-        <w:rPr>
-          <w:rFonts w:hint="eastAsia"/>
-        </w:rPr>
-        <w:t>―その他機能―</w:t>
-      </w:r>
-    </w:p>
-    <w:p>
-      <w:r>
-        <w:rPr>
-          <w:rFonts w:hint="eastAsia"/>
-        </w:rPr>
-        <w:t>▪</w:t>
-      </w:r>
-      <w:r>
-        <w:t>画面レイアウトは、商品はカテゴリー別に４つのタブで分ける</w:t>
-      </w:r>
-    </w:p>
-    <w:p>
-      <w:r>
-        <w:rPr>
-          <w:rFonts w:hint="eastAsia"/>
-        </w:rPr>
         <w:lastRenderedPageBreak/>
         <w:t>▪</w:t>
       </w:r>
       <w:r>
-        <w:t>画面上側に画面遷移を表示する</w:t>
+        <w:t>管理者ログインボタン　ログインすると商品登録・商品情報編集・商品削除・商品情報インポート・エクスポート・購入履歴検索・購入履歴一覧が可能</w:t>
+      </w:r>
+    </w:p>
+    <w:p>
+      <w:r>
+        <w:t> </w:t>
+      </w:r>
+    </w:p>
+    <w:p>
+      <w:r>
+        <w:rPr>
+          <w:rFonts w:hint="eastAsia"/>
+        </w:rPr>
+        <w:t>―その他機能―</w:t>
       </w:r>
     </w:p>
     <w:p>
@@ -868,7 +1018,7 @@
         <w:t>▪</w:t>
       </w:r>
       <w:r>
-        <w:t>カートボタンのバッジ表示が0のときに、カートを押すと商品選択画面が再表示され遷移しない</w:t>
+        <w:t>画面レイアウトは、商品はカテゴリー別に４つのタブで分ける</w:t>
       </w:r>
     </w:p>
     <w:p>
@@ -879,6 +1029,45 @@
         <w:t>▪</w:t>
       </w:r>
       <w:r>
+        <w:t>画面上側</w:t>
+      </w:r>
+      <w:r>
+        <w:rPr>
+          <w:rFonts w:hint="eastAsia"/>
+        </w:rPr>
+        <w:t>にステップバー</w:t>
+      </w:r>
+      <w:r>
+        <w:t>を表示する</w:t>
+      </w:r>
+    </w:p>
+    <w:p>
+      <w:pPr>
+        <w:rPr>
+          <w:rFonts w:hint="eastAsia"/>
+        </w:rPr>
+      </w:pPr>
+      <w:r>
+        <w:rPr>
+          <w:rFonts w:hint="eastAsia"/>
+        </w:rPr>
+        <w:t>▪</w:t>
+      </w:r>
+      <w:r>
+        <w:rPr>
+          <w:rFonts w:hint="eastAsia"/>
+        </w:rPr>
+        <w:t>カート表示</w:t>
+      </w:r>
+    </w:p>
+    <w:p>
+      <w:r>
+        <w:rPr>
+          <w:rFonts w:hint="eastAsia"/>
+        </w:rPr>
+        <w:t>▪</w:t>
+      </w:r>
+      <w:r>
         <w:t>履歴は</w:t>
       </w:r>
       <w:r>
@@ -907,26 +1096,6 @@
         <w:t>▪</w:t>
       </w:r>
       <w:r>
-        <w:t>itemsテーブルのstatusは</w:t>
-      </w:r>
-      <w:r>
-        <w:rPr>
-          <w:rFonts w:hint="eastAsia"/>
-        </w:rPr>
-        <w:t>2種類</w:t>
-      </w:r>
-      <w:r>
-        <w:t>（販売中、非表示（販売停止））</w:t>
-      </w:r>
-    </w:p>
-    <w:p>
-      <w:r>
-        <w:rPr>
-          <w:rFonts w:hint="eastAsia"/>
-        </w:rPr>
-        <w:t>▪</w:t>
-      </w:r>
-      <w:r>
         <w:t>ordered</w:t>
       </w:r>
       <w:r>
@@ -944,18 +1113,65 @@
         <w:rPr>
           <w:rFonts w:hint="eastAsia"/>
         </w:rPr>
-        <w:t>は3種類</w:t>
-      </w:r>
-      <w:r>
-        <w:t>（"cash","ic_card","</w:t>
+        <w:t>は</w:t>
+      </w:r>
+      <w:r>
+        <w:rPr>
+          <w:rFonts w:hint="eastAsia"/>
+        </w:rPr>
+        <w:t>４</w:t>
+      </w:r>
+      <w:r>
+        <w:rPr>
+          <w:rFonts w:hint="eastAsia"/>
+        </w:rPr>
+        <w:t>種類</w:t>
+      </w:r>
+      <w:r>
+        <w:t>（"cash","</w:t>
+      </w:r>
+      <w:r>
+        <w:rPr>
+          <w:rFonts w:hint="eastAsia"/>
+        </w:rPr>
+        <w:t>credit</w:t>
+      </w:r>
+      <w:r>
+        <w:t>","</w:t>
       </w:r>
       <w:proofErr w:type="spellStart"/>
       <w:r>
-        <w:t>qr_code</w:t>
+        <w:rPr>
+          <w:rFonts w:hint="eastAsia"/>
+        </w:rPr>
+        <w:t>paspo</w:t>
       </w:r>
       <w:proofErr w:type="spellEnd"/>
       <w:r>
-        <w:t>"）</w:t>
+        <w:t>"</w:t>
+      </w:r>
+      <w:r>
+        <w:rPr>
+          <w:rFonts w:hint="eastAsia"/>
+        </w:rPr>
+        <w:t>,</w:t>
+      </w:r>
+      <w:r>
+        <w:t>”</w:t>
+      </w:r>
+      <w:proofErr w:type="spellStart"/>
+      <w:r>
+        <w:rPr>
+          <w:rFonts w:hint="eastAsia"/>
+        </w:rPr>
+        <w:t>qr</w:t>
+      </w:r>
+      <w:proofErr w:type="spellEnd"/>
+      <w:r>
+        <w:t>”</w:t>
+      </w:r>
+      <w:r>
+        <w:t>）</w:t>
       </w:r>
     </w:p>
     <w:p/>
@@ -976,6 +1192,19 @@
       </w:r>
     </w:p>
     <w:p>
+      <w:pPr>
+        <w:rPr>
+          <w:rFonts w:hint="eastAsia"/>
+        </w:rPr>
+      </w:pPr>
+      <w:r>
+        <w:rPr>
+          <w:rFonts w:hint="eastAsia"/>
+        </w:rPr>
+        <w:t>▪デモ管理者：商品一覧表示・購入履歴表示</w:t>
+      </w:r>
+    </w:p>
+    <w:p>
       <w:r>
         <w:rPr>
           <w:rFonts w:hint="eastAsia"/>
@@ -994,13 +1223,17 @@
       <w:r>
         <w:t>商品登録・商品情報編集・商品削除・商品情報インポート・エクスポート・購入履歴検索・購入履歴一覧</w:t>
       </w:r>
-    </w:p>
-    <w:p>
-      <w:r>
-        <w:rPr>
-          <w:rFonts w:hint="eastAsia"/>
-        </w:rPr>
-        <w:t>▪上位管理者：パスワード変更</w:t>
+      <w:r>
+        <w:rPr>
+          <w:rFonts w:hint="eastAsia"/>
+        </w:rPr>
+        <w:t>・</w:t>
+      </w:r>
+      <w:r>
+        <w:rPr>
+          <w:rFonts w:hint="eastAsia"/>
+        </w:rPr>
+        <w:t>パスワード変更</w:t>
       </w:r>
     </w:p>
     <w:p/>
@@ -1896,6 +2129,7 @@
           </w:tcPr>
           <w:p>
             <w:r>
+              <w:lastRenderedPageBreak/>
               <w:t>15</w:t>
             </w:r>
           </w:p>
@@ -2068,7 +2302,6 @@
           </w:tcPr>
           <w:p>
             <w:r>
-              <w:lastRenderedPageBreak/>
               <w:t>18</w:t>
             </w:r>
           </w:p>
@@ -2227,13 +2460,7 @@
         </w:tc>
       </w:tr>
     </w:tbl>
-    <w:p>
-      <w:pPr>
-        <w:rPr>
-          <w:rFonts w:hint="eastAsia"/>
-        </w:rPr>
-      </w:pPr>
-    </w:p>
+    <w:p/>
     <w:sectPr>
       <w:pgSz w:w="11906" w:h="16838"/>
       <w:pgMar w:top="1985" w:right="1701" w:bottom="1701" w:left="1701" w:header="851" w:footer="992" w:gutter="0"/>
@@ -2640,6 +2867,7 @@
   <w:style w:type="paragraph" w:default="1" w:styleId="a">
     <w:name w:val="Normal"/>
     <w:qFormat/>
+    <w:rsid w:val="00736E94"/>
     <w:pPr>
       <w:widowControl w:val="0"/>
       <w:jc w:val="both"/>
@@ -2846,6 +3074,7 @@
   <w:style w:type="character" w:default="1" w:styleId="a0">
     <w:name w:val="Default Paragraph Font"/>
     <w:uiPriority w:val="1"/>
+    <w:semiHidden/>
     <w:unhideWhenUsed/>
   </w:style>
   <w:style w:type="table" w:default="1" w:styleId="a1">

</xml_diff>